<commit_message>
docs: plain language review complete for chapter 3
</commit_message>
<xml_diff>
--- a/docs/thesis-chapter-3.docx
+++ b/docs/thesis-chapter-3.docx
@@ -26,13 +26,87 @@
         <w:jc w:val="left"/>
       </w:pPr>
       <w:r>
+        <w:t>3.2 Software Architecture Patterns</w:t>
+      </w:r>
+    </w:p>
+    <w:p>
+      <w:pPr>
+        <w:spacing w:line="360" w:lineRule="exact"/>
+      </w:pPr>
+      <w:r>
         <w:rPr>
           <w:rFonts w:ascii="Times New Roman" w:hAnsi="Times New Roman"/>
-          <w:b/>
-          <w:i w:val="0"/>
-          <w:sz w:val="26"/>
+          <w:sz w:val="24"/>
         </w:rPr>
-        <w:t>3.1 Software Architecture Patterns</w:t>
+        <w:t>A multi-tier architecture separates a system into layers, and each layer has a clear responsibility. In Archon, the React and Vite frontend is the presentation layer, the Express API server is the application layer where business rules run, and MongoDB plus ChromaDB form the data layer. ChromaDB is a vector store, while MongoDB holds structured records. This separation lets the interface, logic, and storage evolve independently.</w:t>
+      </w:r>
+    </w:p>
+    <w:p>
+      <w:pPr>
+        <w:spacing w:line="360" w:lineRule="exact"/>
+      </w:pPr>
+      <w:r>
+        <w:rPr>
+          <w:rFonts w:ascii="Times New Roman" w:hAnsi="Times New Roman"/>
+          <w:sz w:val="24"/>
+        </w:rPr>
+        <w:t>RESTful API design organizes endpoints around resources such as documents, conversations, and users, and it uses standard HTTP verbs. Each request is stateless, meaning the server does not depend on prior requests to process the current one. The backend exposes routes for authentication, documents, conversations, organizations, and users, and it returns structured responses. It also uses middleware (shared request-processing steps) for cross-cutting tasks like security checks and usage limits.</w:t>
+      </w:r>
+    </w:p>
+    <w:p>
+      <w:pPr>
+        <w:spacing w:line="360" w:lineRule="exact"/>
+      </w:pPr>
+      <w:r>
+        <w:rPr>
+          <w:rFonts w:ascii="Times New Roman" w:hAnsi="Times New Roman"/>
+          <w:sz w:val="24"/>
+        </w:rPr>
+        <w:t>The multi-tenancy pattern keeps each organization's data separate while sharing the same application infrastructure. Archon scopes queries and access controls to the active organization so that documents, conversations, and user data are isolated. It enforces role-based access control (RBAC), which assigns permissions based on user roles. Join requests and invite codes help manage membership boundaries.</w:t>
+      </w:r>
+    </w:p>
+    <w:p>
+      <w:pPr>
+        <w:spacing w:line="360" w:lineRule="exact"/>
+      </w:pPr>
+      <w:r>
+        <w:rPr>
+          <w:rFonts w:ascii="Times New Roman" w:hAnsi="Times New Roman"/>
+          <w:sz w:val="24"/>
+        </w:rPr>
+        <w:t>The service layer pattern keeps controllers focused on HTTP handling and places core business logic in separate services. In Archon, services handle tasks like document indexing and retrieval logic, while controllers manage requests and responses. This improves testability and reuse and prevents low-level details from leaking into the request layer.</w:t>
+      </w:r>
+    </w:p>
+    <w:p>
+      <w:pPr>
+        <w:spacing w:line="360" w:lineRule="exact"/>
+      </w:pPr>
+      <w:r>
+        <w:rPr>
+          <w:rFonts w:ascii="Times New Roman" w:hAnsi="Times New Roman"/>
+          <w:sz w:val="24"/>
+        </w:rPr>
+        <w:t>Retrieval-Augmented Generation (RAG) combines information retrieval with a Large Language Model (LLM). Archon first expands a query into alternative phrasings, then converts each version into a text embedding (a numeric representation of meaning) for similarity search. It retrieves the most relevant document sections, adds them to the prompt, and then Gemini generates the final answer based only on that context. This reduces hallucination risk — the risk of the AI generating incorrect or made-up information — and keeps answers grounded in the source documents.</w:t>
+      </w:r>
+    </w:p>
+    <w:p>
+      <w:pPr>
+        <w:pStyle w:val="Heading1"/>
+        <w:spacing w:line="360" w:lineRule="exact" w:before="240" w:after="240"/>
+        <w:jc w:val="left"/>
+      </w:pPr>
+      <w:r>
+        <w:t>3.3 Technology Stack</w:t>
+      </w:r>
+    </w:p>
+    <w:p>
+      <w:pPr>
+        <w:pStyle w:val="Heading2"/>
+        <w:spacing w:line="360" w:lineRule="exact" w:before="240" w:after="240"/>
+        <w:jc w:val="left"/>
+      </w:pPr>
+      <w:r>
+        <w:t>3.3.1 Backend</w:t>
       </w:r>
     </w:p>
     <w:p>
@@ -47,7 +121,17 @@
           <w:i w:val="0"/>
           <w:sz w:val="24"/>
         </w:rPr>
-        <w:t>Multi-tier architecture separates presentation, application logic, and data management into distinct layers to improve maintainability and scalability. In Archon, the React and Vite frontend forms the presentation layer, the Express-based API server provides the application layer, and MongoDB with ChromaDB represents the data layer for metadata and vector search. This separation enables independent evolution of the user interface, business logic, and storage concerns.</w:t>
+        <w:t>Node.js provides a runtime environment that can handle multiple tasks simultaneously without waiting for each one to finish. This makes it well suited for document processing, external API calls, and serving multiple users at the same time. Express 5 was selected for its modern routing layer and simplified error handling, which makes it easier to build and maintain the API. MongoDB offers flexible document storage for user and document metadata, while Mongoose adds schema validation and query modeling to enforce consistency across collections.</w:t>
+      </w:r>
+    </w:p>
+    <w:p>
+      <w:pPr>
+        <w:pStyle w:val="Heading2"/>
+        <w:spacing w:line="360" w:lineRule="exact" w:before="240" w:after="240"/>
+        <w:jc w:val="left"/>
+      </w:pPr>
+      <w:r>
+        <w:t>3.3.2 Vector Database</w:t>
       </w:r>
     </w:p>
     <w:p>
@@ -62,7 +146,18 @@
           <w:i w:val="0"/>
           <w:sz w:val="24"/>
         </w:rPr>
-        <w:t>RESTful API design organizes functionality around resource-oriented endpoints, uses standard HTTP verbs, and keeps requests stateless to support scalability. The backend exposes distinct routes for authentication, documents, conversations, organizations, and users, each returning JSON responses and relying on middleware for cross-cutting concerns such as rate limiting and authorization. This structure supports clear integration contracts for the frontend and simplifies maintenance.</w:t>
+        <w:t>ChromaDB is a specialized search database that stores numerical representations of text — known as embeddings — to enable meaning-based search rather than exact keyword matching. It finds document sections based on meaning and can filter results by document properties such as which file they belong to. It was chosen because it can be deployed as a separate service within the same infrastructure environment and supports search operations that can be restricted to a specific set of documents. This enables fast and accurate retrieval while keeping full control over the search database within the deployment environment.</w:t>
+      </w:r>
+    </w:p>
+    <w:p/>
+    <w:p>
+      <w:pPr>
+        <w:pStyle w:val="Heading2"/>
+        <w:spacing w:line="360" w:lineRule="exact" w:before="240" w:after="240"/>
+        <w:jc w:val="left"/>
+      </w:pPr>
+      <w:r>
+        <w:t>3.3.3 AI/LLM Layer</w:t>
       </w:r>
     </w:p>
     <w:p>
@@ -77,7 +172,17 @@
           <w:i w:val="0"/>
           <w:sz w:val="24"/>
         </w:rPr>
-        <w:t>The multi-tenancy pattern isolates tenant data while sharing the same application infrastructure. Archon implements organization-scoped data models and access controls, ensuring that documents, conversations, and user data are queried within the current organization context and protected by role-based access control (RBAC). Join requests and invite codes are used to manage membership boundaries, reinforcing tenant isolation in both application logic and data access.</w:t>
+        <w:t>Gemini 2.5 Flash provides low-latency chat generation suitable for interactive question answering. The gemini-embedding-001 model was selected to produce consistent embeddings compatible with the Google API used by the system. LangChain is employed for a text splitting component that breaks documents into 1500-character segments with 200-character overlap to preserve context while keeping sections small enough to search, and for a wrapper that manages how questions and context are structured before being sent to the AI.</w:t>
+      </w:r>
+    </w:p>
+    <w:p>
+      <w:pPr>
+        <w:pStyle w:val="Heading2"/>
+        <w:spacing w:line="360" w:lineRule="exact" w:before="240" w:after="240"/>
+        <w:jc w:val="left"/>
+      </w:pPr>
+      <w:r>
+        <w:t>3.3.4 Frontend</w:t>
       </w:r>
     </w:p>
     <w:p>
@@ -92,38 +197,7 @@
           <w:i w:val="0"/>
           <w:sz w:val="24"/>
         </w:rPr>
-        <w:t>The service layer pattern separates controllers from core business logic, improving testability and reusability. In Archon, controllers handle HTTP concerns while services such as the embedding pipeline, vector database operations, and retrieval logic encapsulate domain behavior. This separation aligns with the Controller → Service → Model structure and limits the propagation of infrastructure details into request handling code.</w:t>
-      </w:r>
-    </w:p>
-    <w:p>
-      <w:pPr>
-        <w:spacing w:line="360" w:lineRule="exact" w:before="0" w:after="240"/>
-        <w:jc w:val="both"/>
-      </w:pPr>
-      <w:r>
-        <w:rPr>
-          <w:rFonts w:ascii="Times New Roman" w:hAnsi="Times New Roman"/>
-          <w:b w:val="0"/>
-          <w:i w:val="0"/>
-          <w:sz w:val="24"/>
-        </w:rPr>
-        <w:t>Retrieval-Augmented Generation (RAG) combines information retrieval with a Large Language Model (LLM) to ground responses in authoritative sources. The Archon pipeline expands each query into alternative phrasings, embeds the expanded queries, retrieves the most relevant vectors from ChromaDB, injects the retrieved context into the prompt, and then generates the answer using Gemini. This sequence reduces hallucination risk and produces responses tied to the underlying documents.</w:t>
-      </w:r>
-    </w:p>
-    <w:p>
-      <w:pPr>
-        <w:pStyle w:val="Heading1"/>
-        <w:spacing w:line="360" w:lineRule="exact" w:before="240" w:after="240"/>
-        <w:jc w:val="left"/>
-      </w:pPr>
-      <w:r>
-        <w:rPr>
-          <w:rFonts w:ascii="Times New Roman" w:hAnsi="Times New Roman"/>
-          <w:b/>
-          <w:i w:val="0"/>
-          <w:sz w:val="26"/>
-        </w:rPr>
-        <w:t>3.2 Technology Stack</w:t>
+        <w:t>React 19 offers a component-based architecture that supports reusable UI composition and predictable state management. Vite was chosen for its fast development server and optimized builds, which shorten iteration cycles. Tailwind CSS v4 provides a styling approach that uses small reusable building blocks to create a consistent visual design, and React Router v7 manages page navigation and ensures that certain pages are only accessible to logged-in users.</w:t>
       </w:r>
     </w:p>
     <w:p>
@@ -133,133 +207,7 @@
         <w:jc w:val="left"/>
       </w:pPr>
       <w:r>
-        <w:rPr>
-          <w:rFonts w:ascii="Times New Roman" w:hAnsi="Times New Roman"/>
-          <w:b/>
-          <w:i w:val="0"/>
-          <w:sz w:val="24"/>
-        </w:rPr>
-        <w:t>3.2.1 Backend</w:t>
-      </w:r>
-    </w:p>
-    <w:p>
-      <w:pPr>
-        <w:spacing w:line="360" w:lineRule="exact" w:before="0" w:after="240"/>
-        <w:jc w:val="both"/>
-      </w:pPr>
-      <w:r>
-        <w:rPr>
-          <w:rFonts w:ascii="Times New Roman" w:hAnsi="Times New Roman"/>
-          <w:b w:val="0"/>
-          <w:i w:val="0"/>
-          <w:sz w:val="24"/>
-        </w:rPr>
-        <w:t>Node.js provides a non-blocking runtime that suits document processing, external API calls, and concurrent user requests. Express 5 was selected for its modernized routing layer and native support for promise-based handlers, which simplifies middleware composition and error propagation. MongoDB offers flexible document storage for user and document metadata, while Mongoose adds schema validation and query modeling to enforce consistency across collections.</w:t>
-      </w:r>
-    </w:p>
-    <w:p>
-      <w:pPr>
-        <w:pStyle w:val="Heading2"/>
-        <w:spacing w:line="360" w:lineRule="exact" w:before="240" w:after="240"/>
-        <w:jc w:val="left"/>
-      </w:pPr>
-      <w:r>
-        <w:rPr>
-          <w:rFonts w:ascii="Times New Roman" w:hAnsi="Times New Roman"/>
-          <w:b/>
-          <w:i w:val="0"/>
-          <w:sz w:val="24"/>
-        </w:rPr>
-        <w:t>3.2.2 Vector Database</w:t>
-      </w:r>
-    </w:p>
-    <w:p>
-      <w:pPr>
-        <w:spacing w:line="360" w:lineRule="exact" w:before="0" w:after="240"/>
-        <w:jc w:val="both"/>
-      </w:pPr>
-      <w:r>
-        <w:rPr>
-          <w:rFonts w:ascii="Times New Roman" w:hAnsi="Times New Roman"/>
-          <w:sz w:val="24"/>
-        </w:rPr>
-        <w:t>ChromaDB is a vector database designed for similarity search over embeddings with metadata filtering. It was chosen because it can be deployed as a separate service within the same infrastructure environment and supports collection operations that align with document-scoped retrieval. This enables fast semantic search while keeping control over the vector store within the deployment environment.</w:t>
-      </w:r>
-    </w:p>
-    <w:p>
-      <w:pPr>
-        <w:pStyle w:val="Heading2"/>
-        <w:spacing w:line="360" w:lineRule="exact" w:before="240" w:after="240"/>
-        <w:jc w:val="left"/>
-      </w:pPr>
-      <w:r>
-        <w:rPr>
-          <w:rFonts w:ascii="Times New Roman" w:hAnsi="Times New Roman"/>
-          <w:b/>
-          <w:i w:val="0"/>
-          <w:sz w:val="24"/>
-        </w:rPr>
-        <w:t>3.2.3 AI/LLM Layer</w:t>
-      </w:r>
-    </w:p>
-    <w:p>
-      <w:pPr>
-        <w:spacing w:line="360" w:lineRule="exact" w:before="0" w:after="240"/>
-        <w:jc w:val="both"/>
-      </w:pPr>
-      <w:r>
-        <w:rPr>
-          <w:rFonts w:ascii="Times New Roman" w:hAnsi="Times New Roman"/>
-          <w:sz w:val="24"/>
-        </w:rPr>
-        <w:t>Gemini 2.5 Flash provides low-latency chat generation suitable for interactive question answering. The gemini-embedding-001 model was selected to produce consistent embeddings compatible with the Google API used by the system. LangChain is employed for its RecursiveCharacterTextSplitter, which chunks documents into 1500-character segments with 200-character overlap to balance context preservation and retrieval granularity, and for its ChatGoogleGenerativeAI wrapper which provides structured prompt orchestration for the RAG pipeline.</w:t>
-      </w:r>
-    </w:p>
-    <w:p>
-      <w:pPr>
-        <w:pStyle w:val="Heading2"/>
-        <w:spacing w:line="360" w:lineRule="exact" w:before="240" w:after="240"/>
-        <w:jc w:val="left"/>
-      </w:pPr>
-      <w:r>
-        <w:rPr>
-          <w:rFonts w:ascii="Times New Roman" w:hAnsi="Times New Roman"/>
-          <w:b/>
-          <w:i w:val="0"/>
-          <w:sz w:val="24"/>
-        </w:rPr>
-        <w:t>3.2.4 Frontend</w:t>
-      </w:r>
-    </w:p>
-    <w:p>
-      <w:pPr>
-        <w:spacing w:line="360" w:lineRule="exact" w:before="0" w:after="240"/>
-        <w:jc w:val="both"/>
-      </w:pPr>
-      <w:r>
-        <w:rPr>
-          <w:rFonts w:ascii="Times New Roman" w:hAnsi="Times New Roman"/>
-          <w:b w:val="0"/>
-          <w:i w:val="0"/>
-          <w:sz w:val="24"/>
-        </w:rPr>
-        <w:t>React 19 offers a component-based architecture that supports reusable UI composition and predictable state management. Vite was chosen for its fast development server and optimized builds, which shorten iteration cycles. Tailwind CSS v4 provides a utility-first styling approach that standardizes design tokens, and React Router v7 manages nested routes and protected views required by authenticated flows.</w:t>
-      </w:r>
-    </w:p>
-    <w:p>
-      <w:pPr>
-        <w:pStyle w:val="Heading2"/>
-        <w:spacing w:line="360" w:lineRule="exact" w:before="240" w:after="240"/>
-        <w:jc w:val="left"/>
-      </w:pPr>
-      <w:r>
-        <w:rPr>
-          <w:rFonts w:ascii="Times New Roman" w:hAnsi="Times New Roman"/>
-          <w:b/>
-          <w:i w:val="0"/>
-          <w:sz w:val="24"/>
-        </w:rPr>
-        <w:t>3.2.5 Deployment</w:t>
+        <w:t>3.3.5 Deployment</w:t>
       </w:r>
     </w:p>
     <w:p>
@@ -284,13 +232,7 @@
         <w:jc w:val="left"/>
       </w:pPr>
       <w:r>
-        <w:rPr>
-          <w:rFonts w:ascii="Times New Roman" w:hAnsi="Times New Roman"/>
-          <w:b/>
-          <w:i w:val="0"/>
-          <w:sz w:val="24"/>
-        </w:rPr>
-        <w:t>3.2.6 Email Service</w:t>
+        <w:t>3.3.6 Email Service</w:t>
       </w:r>
     </w:p>
     <w:p>
@@ -315,13 +257,7 @@
         <w:jc w:val="left"/>
       </w:pPr>
       <w:r>
-        <w:rPr>
-          <w:rFonts w:ascii="Times New Roman" w:hAnsi="Times New Roman"/>
-          <w:b/>
-          <w:i w:val="0"/>
-          <w:sz w:val="26"/>
-        </w:rPr>
-        <w:t>3.3 Related Work</w:t>
+        <w:t>3.4 Related Work</w:t>
       </w:r>
     </w:p>
     <w:p>
@@ -331,13 +267,7 @@
         <w:jc w:val="left"/>
       </w:pPr>
       <w:r>
-        <w:rPr>
-          <w:rFonts w:ascii="Times New Roman" w:hAnsi="Times New Roman"/>
-          <w:b/>
-          <w:i w:val="0"/>
-          <w:sz w:val="24"/>
-        </w:rPr>
-        <w:t>3.3.1 Landscape of Existing Solutions</w:t>
+        <w:t>3.4.1 Landscape of Existing Solutions</w:t>
       </w:r>
     </w:p>
     <w:p>
@@ -407,13 +337,7 @@
         <w:jc w:val="left"/>
       </w:pPr>
       <w:r>
-        <w:rPr>
-          <w:rFonts w:ascii="Times New Roman" w:hAnsi="Times New Roman"/>
-          <w:b/>
-          <w:i w:val="0"/>
-          <w:sz w:val="24"/>
-        </w:rPr>
-        <w:t>3.3.2 Gap Analysis &amp; Strategic Improvements</w:t>
+        <w:t>3.4.2 Gap Analysis &amp; Strategic Improvements</w:t>
       </w:r>
     </w:p>
     <w:p>
@@ -1430,10 +1354,20 @@
       <w:r>
         <w:rPr>
           <w:rFonts w:ascii="Times New Roman" w:hAnsi="Times New Roman"/>
+          <w:b w:val="0"/>
           <w:i/>
           <w:sz w:val="24"/>
         </w:rPr>
         <w:t>Table 1: Comparison of enterprise Q&amp;A solutions and Archon</w:t>
+      </w:r>
+    </w:p>
+    <w:p>
+      <w:pPr>
+        <w:spacing w:line="360" w:lineRule="exact" w:before="0" w:after="240"/>
+        <w:jc w:val="both"/>
+      </w:pPr>
+      <w:r>
+        <w:t>Archon is positioned as a controllable alternative to vendor-managed platforms by providing organization-level isolation and a transparent retrieval workflow. It uses explicit query expansion and restricts search to chosen documents, which helps keep answers precise and aligned with approved materials. These choices make it easier to verify where answers come from and to follow internal policies.</w:t>
       </w:r>
     </w:p>
     <w:p>
@@ -1448,22 +1382,7 @@
           <w:i w:val="0"/>
           <w:sz w:val="24"/>
         </w:rPr>
-        <w:t>Archon is positioned as a controllable alternative to vendor-managed platforms by providing organization-scoped isolation and a transparent retrieval workflow. The use of explicit query expansion and document-scoped retrieval supports precise answers for enterprise collections where relevance must be constrained to approved materials. These choices emphasize auditability and alignment with internal governance requirements.</w:t>
-      </w:r>
-    </w:p>
-    <w:p>
-      <w:pPr>
-        <w:spacing w:line="360" w:lineRule="exact" w:before="0" w:after="240"/>
-        <w:jc w:val="both"/>
-      </w:pPr>
-      <w:r>
-        <w:rPr>
-          <w:rFonts w:ascii="Times New Roman" w:hAnsi="Times New Roman"/>
-          <w:b w:val="0"/>
-          <w:i w:val="0"/>
-          <w:sz w:val="24"/>
-        </w:rPr>
-        <w:t>The architecture further differentiates itself by enabling a self-hosted vector store and a custom embedding pipeline, which allow deployment in environments with strict data residency or compliance constraints. This positioning favors teams that require ownership of retrieval logic, model choices, and infrastructure while still benefiting from modern LLM-based question answering.</w:t>
+        <w:t>The architecture also enables a self-hosted vector store and a custom embedding pipeline. These choices allow deployment in environments with data residency or compliance constraints (requirements that data must be stored and processed within a specific location or under specific rules).</w:t>
       </w:r>
     </w:p>
     <w:sectPr>

</xml_diff>